<commit_message>
add second aorist forms from chapter 12
</commit_message>
<xml_diff>
--- a/worksheets/Ch 11 Practice.docx
+++ b/worksheets/Ch 11 Practice.docx
@@ -253,27 +253,7 @@
                 <w:sz w:val="28"/>
                 <w:szCs w:val="28"/>
               </w:rPr>
-              <w:t>π</w:t>
-            </w:r>
-            <w:proofErr w:type="spellStart"/>
-            <w:r>
-              <w:rPr>
-                <w:rFonts w:ascii="Calibri" w:hAnsi="Calibri" w:cs="Calibri"/>
-                <w:color w:val="000000"/>
-                <w:sz w:val="28"/>
-                <w:szCs w:val="28"/>
-              </w:rPr>
-              <w:t>έμ</w:t>
-            </w:r>
-            <w:proofErr w:type="spellEnd"/>
-            <w:r>
-              <w:rPr>
-                <w:rFonts w:ascii="Calibri" w:hAnsi="Calibri" w:cs="Calibri"/>
-                <w:color w:val="000000"/>
-                <w:sz w:val="28"/>
-                <w:szCs w:val="28"/>
-              </w:rPr>
-              <w:t>πω</w:t>
+              <w:t>πέμπω</w:t>
             </w:r>
           </w:p>
           <w:p/>
@@ -406,19 +386,8 @@
                 <w:sz w:val="28"/>
                 <w:szCs w:val="28"/>
               </w:rPr>
-              <w:t>π</w:t>
-            </w:r>
-            <w:proofErr w:type="spellStart"/>
-            <w:r>
-              <w:rPr>
-                <w:rFonts w:ascii="Calibri" w:hAnsi="Calibri" w:cs="Calibri"/>
-                <w:color w:val="000000"/>
-                <w:sz w:val="28"/>
-                <w:szCs w:val="28"/>
-              </w:rPr>
-              <w:t>ράσσω</w:t>
-            </w:r>
-            <w:proofErr w:type="spellEnd"/>
+              <w:t>πράσσω</w:t>
+            </w:r>
           </w:p>
           <w:p/>
         </w:tc>
@@ -537,7 +506,6 @@
                 <w:szCs w:val="28"/>
               </w:rPr>
             </w:pPr>
-            <w:proofErr w:type="spellStart"/>
             <w:r>
               <w:rPr>
                 <w:rFonts w:ascii="Calibri" w:hAnsi="Calibri" w:cs="Calibri"/>
@@ -547,7 +515,6 @@
               </w:rPr>
               <w:t>διώκω</w:t>
             </w:r>
-            <w:proofErr w:type="spellEnd"/>
           </w:p>
           <w:p/>
         </w:tc>
@@ -676,26 +643,15 @@
                 <w:sz w:val="28"/>
                 <w:szCs w:val="28"/>
               </w:rPr>
-              <w:t>π</w:t>
-            </w:r>
-            <w:proofErr w:type="spellStart"/>
-            <w:r>
-              <w:rPr>
-                <w:rFonts w:ascii="Calibri" w:hAnsi="Calibri" w:cs="Calibri"/>
-                <w:color w:val="000000"/>
+              <w:t>πιστευω</w:t>
+            </w:r>
+          </w:p>
+          <w:p>
+            <w:pPr>
+              <w:rPr>
                 <w:sz w:val="28"/>
                 <w:szCs w:val="28"/>
               </w:rPr>
-              <w:t>ιστευω</w:t>
-            </w:r>
-            <w:proofErr w:type="spellEnd"/>
-          </w:p>
-          <w:p>
-            <w:pPr>
-              <w:rPr>
-                <w:sz w:val="28"/>
-                <w:szCs w:val="28"/>
-              </w:rPr>
             </w:pPr>
           </w:p>
         </w:tc>
@@ -704,7 +660,6 @@
             <w:tcW w:w="1350" w:type="dxa"/>
           </w:tcPr>
           <w:p>
-            <w:proofErr w:type="gramStart"/>
             <w:r>
               <w:t>2</w:t>
             </w:r>
@@ -714,7 +669,6 @@
               </w:rPr>
               <w:t>rd</w:t>
             </w:r>
-            <w:proofErr w:type="gramEnd"/>
           </w:p>
         </w:tc>
         <w:tc>
@@ -831,7 +785,6 @@
               </w:rPr>
               <w:t>π</w:t>
             </w:r>
-            <w:proofErr w:type="spellStart"/>
             <w:r>
               <w:rPr>
                 <w:sz w:val="28"/>
@@ -839,7 +792,6 @@
               </w:rPr>
               <w:t>ροσκυνέω</w:t>
             </w:r>
-            <w:proofErr w:type="spellEnd"/>
           </w:p>
         </w:tc>
         <w:tc>
@@ -955,7 +907,6 @@
                 <w:szCs w:val="28"/>
               </w:rPr>
             </w:pPr>
-            <w:proofErr w:type="spellStart"/>
             <w:r>
               <w:rPr>
                 <w:sz w:val="28"/>
@@ -963,7 +914,6 @@
               </w:rPr>
               <w:t>τηρέω</w:t>
             </w:r>
-            <w:proofErr w:type="spellEnd"/>
           </w:p>
           <w:p>
             <w:pPr>
@@ -1098,17 +1048,8 @@
                 <w:sz w:val="28"/>
                 <w:szCs w:val="28"/>
               </w:rPr>
-              <w:t>ἀπ</w:t>
-            </w:r>
-            <w:proofErr w:type="spellStart"/>
-            <w:r>
-              <w:rPr>
-                <w:sz w:val="28"/>
-                <w:szCs w:val="28"/>
-              </w:rPr>
-              <w:t>ολύω</w:t>
-            </w:r>
-            <w:proofErr w:type="spellEnd"/>
+              <w:t>ἀπολύω</w:t>
+            </w:r>
           </w:p>
           <w:p>
             <w:pPr>
@@ -1243,23 +1184,7 @@
                 <w:sz w:val="28"/>
                 <w:szCs w:val="28"/>
               </w:rPr>
-              <w:t>π</w:t>
-            </w:r>
-            <w:proofErr w:type="spellStart"/>
-            <w:r>
-              <w:rPr>
-                <w:sz w:val="28"/>
-                <w:szCs w:val="28"/>
-              </w:rPr>
-              <w:t>ροσεύχομ</w:t>
-            </w:r>
-            <w:proofErr w:type="spellEnd"/>
-            <w:r>
-              <w:rPr>
-                <w:sz w:val="28"/>
-                <w:szCs w:val="28"/>
-              </w:rPr>
-              <w:t>αι</w:t>
+              <w:t>προσεύχομαι</w:t>
             </w:r>
           </w:p>
           <w:p>
@@ -1390,7 +1315,6 @@
                 <w:szCs w:val="28"/>
               </w:rPr>
             </w:pPr>
-            <w:proofErr w:type="spellStart"/>
             <w:r>
               <w:rPr>
                 <w:sz w:val="28"/>
@@ -1398,7 +1322,6 @@
               </w:rPr>
               <w:t>ἀνοίγω</w:t>
             </w:r>
-            <w:proofErr w:type="spellEnd"/>
           </w:p>
           <w:p>
             <w:pPr>
@@ -1515,13 +1438,8 @@
                 </wp:inline>
               </w:drawing>
             </w:r>
-            <w:proofErr w:type="gramStart"/>
-            <w:r>
-              <w:t>why</w:t>
-            </w:r>
-            <w:proofErr w:type="gramEnd"/>
-            <w:r>
-              <w:t xml:space="preserve"> is the zeta dropped?</w:t>
+            <w:r>
+              <w:t>why is the zeta dropped?</w:t>
             </w:r>
           </w:p>
         </w:tc>
@@ -1536,7 +1454,6 @@
                 <w:szCs w:val="28"/>
               </w:rPr>
             </w:pPr>
-            <w:proofErr w:type="spellStart"/>
             <w:r>
               <w:rPr>
                 <w:sz w:val="28"/>
@@ -1544,7 +1461,6 @@
               </w:rPr>
               <w:t>σῴζω</w:t>
             </w:r>
-            <w:proofErr w:type="spellEnd"/>
           </w:p>
           <w:p>
             <w:pPr>
@@ -1757,15 +1673,7 @@
           </w:p>
           <w:p>
             <w:r>
-              <w:t xml:space="preserve">1st </w:t>
-            </w:r>
-            <w:proofErr w:type="gramStart"/>
-            <w:r>
-              <w:t>sing</w:t>
-            </w:r>
-            <w:proofErr w:type="gramEnd"/>
-            <w:r>
-              <w:t xml:space="preserve"> active</w:t>
+              <w:t>1st sing active</w:t>
             </w:r>
           </w:p>
           <w:p>
@@ -1875,12 +1783,10 @@
             <w:tcW w:w="525" w:type="dxa"/>
           </w:tcPr>
           <w:p>
-            <w:proofErr w:type="spellStart"/>
             <w:r>
               <w:lastRenderedPageBreak/>
               <w:t>ans</w:t>
             </w:r>
-            <w:proofErr w:type="spellEnd"/>
           </w:p>
         </w:tc>
         <w:tc>
@@ -1932,25 +1838,12 @@
               <w:t>rd</w:t>
             </w:r>
             <w:r>
-              <w:t xml:space="preserve"> </w:t>
-            </w:r>
-            <w:proofErr w:type="gramStart"/>
-            <w:r>
-              <w:t>sing</w:t>
-            </w:r>
-            <w:proofErr w:type="gramEnd"/>
-            <w:r>
-              <w:t xml:space="preserve"> active </w:t>
-            </w:r>
-          </w:p>
-          <w:p>
-            <w:proofErr w:type="spellStart"/>
-            <w:r>
-              <w:t>he,she,it</w:t>
-            </w:r>
-            <w:proofErr w:type="spellEnd"/>
-            <w:r>
-              <w:t xml:space="preserve"> cried out      </w:t>
+              <w:t xml:space="preserve"> sing active </w:t>
+            </w:r>
+          </w:p>
+          <w:p>
+            <w:r>
+              <w:t xml:space="preserve">he,she,it cried out      </w:t>
             </w:r>
           </w:p>
         </w:tc>
@@ -2062,11 +1955,9 @@
             <w:tcW w:w="525" w:type="dxa"/>
           </w:tcPr>
           <w:p>
-            <w:proofErr w:type="spellStart"/>
             <w:r>
               <w:t>ans</w:t>
             </w:r>
-            <w:proofErr w:type="spellEnd"/>
           </w:p>
         </w:tc>
         <w:tc>
@@ -2075,13 +1966,8 @@
             <w:gridSpan w:val="7"/>
           </w:tcPr>
           <w:p>
-            <w:proofErr w:type="gramStart"/>
-            <w:r>
-              <w:t>so</w:t>
-            </w:r>
-            <w:proofErr w:type="gramEnd"/>
-            <w:r>
-              <w:t xml:space="preserve"> Jesus cried out in the temple</w:t>
+            <w:r>
+              <w:t>so Jesus cried out in the temple</w:t>
             </w:r>
           </w:p>
         </w:tc>
@@ -2123,13 +2009,8 @@
           </w:p>
           <w:p>
             <w:r>
-              <w:t xml:space="preserve">Nominative </w:t>
-            </w:r>
-            <w:proofErr w:type="gramStart"/>
-            <w:r>
-              <w:t>sing</w:t>
-            </w:r>
-            <w:proofErr w:type="gramEnd"/>
+              <w:t>Nominative sing</w:t>
+            </w:r>
           </w:p>
           <w:p>
             <w:r>
@@ -2160,15 +2041,7 @@
               <w:t>rd</w:t>
             </w:r>
             <w:r>
-              <w:t xml:space="preserve"> </w:t>
-            </w:r>
-            <w:proofErr w:type="gramStart"/>
-            <w:r>
-              <w:t>sing</w:t>
-            </w:r>
-            <w:proofErr w:type="gramEnd"/>
-            <w:r>
-              <w:t xml:space="preserve"> active</w:t>
+              <w:t xml:space="preserve"> sing active</w:t>
             </w:r>
           </w:p>
           <w:p>
@@ -2267,11 +2140,9 @@
             <w:tcW w:w="525" w:type="dxa"/>
           </w:tcPr>
           <w:p>
-            <w:proofErr w:type="spellStart"/>
             <w:r>
               <w:t>ans</w:t>
             </w:r>
-            <w:proofErr w:type="spellEnd"/>
           </w:p>
         </w:tc>
         <w:tc>
@@ -2446,11 +2317,9 @@
             <w:tcW w:w="525" w:type="dxa"/>
           </w:tcPr>
           <w:p>
-            <w:proofErr w:type="spellStart"/>
             <w:r>
               <w:t>ans</w:t>
             </w:r>
-            <w:proofErr w:type="spellEnd"/>
           </w:p>
         </w:tc>
         <w:tc>
@@ -2556,13 +2425,8 @@
             </w:r>
           </w:p>
           <w:p>
-            <w:proofErr w:type="spellStart"/>
-            <w:r>
-              <w:t>to,into</w:t>
-            </w:r>
-            <w:proofErr w:type="spellEnd"/>
-            <w:r>
-              <w:t xml:space="preserve"> (accusative case</w:t>
+            <w:r>
+              <w:t>to,into (accusative case</w:t>
             </w:r>
             <w:r>
               <w:t xml:space="preserve">, but often overlaps with </w:t>
@@ -2595,15 +2459,7 @@
           </w:p>
           <w:p>
             <w:r>
-              <w:t xml:space="preserve">sing </w:t>
-            </w:r>
-            <w:proofErr w:type="spellStart"/>
-            <w:r>
-              <w:t>masc</w:t>
-            </w:r>
-            <w:proofErr w:type="spellEnd"/>
-            <w:r>
-              <w:t xml:space="preserve"> accusative</w:t>
+              <w:t>sing masc accusative</w:t>
             </w:r>
           </w:p>
         </w:tc>
@@ -2754,11 +2610,9 @@
             <w:tcW w:w="525" w:type="dxa"/>
           </w:tcPr>
           <w:p>
-            <w:proofErr w:type="spellStart"/>
             <w:r>
               <w:t>ans</w:t>
             </w:r>
-            <w:proofErr w:type="spellEnd"/>
           </w:p>
         </w:tc>
         <w:tc>
@@ -2852,15 +2706,7 @@
           </w:p>
           <w:p>
             <w:r>
-              <w:t xml:space="preserve">Sing </w:t>
-            </w:r>
-            <w:proofErr w:type="spellStart"/>
-            <w:r>
-              <w:t>masc</w:t>
-            </w:r>
-            <w:proofErr w:type="spellEnd"/>
-            <w:r>
-              <w:t xml:space="preserve"> accusative</w:t>
+              <w:t>Sing masc accusative</w:t>
             </w:r>
           </w:p>
         </w:tc>
@@ -2920,11 +2766,9 @@
             <w:tcW w:w="525" w:type="dxa"/>
           </w:tcPr>
           <w:p>
-            <w:proofErr w:type="spellStart"/>
             <w:r>
               <w:t>ans</w:t>
             </w:r>
-            <w:proofErr w:type="spellEnd"/>
           </w:p>
         </w:tc>
         <w:tc>
@@ -3008,15 +2852,7 @@
           </w:p>
           <w:p>
             <w:r>
-              <w:t>π</w:t>
-            </w:r>
-            <w:proofErr w:type="spellStart"/>
-            <w:r>
-              <w:t>ροσεύχομ</w:t>
-            </w:r>
-            <w:proofErr w:type="spellEnd"/>
-            <w:r>
-              <w:t>αι</w:t>
+              <w:t>προσεύχομαι</w:t>
             </w:r>
             <w:r>
               <w:t xml:space="preserve"> </w:t>
@@ -3094,14 +2930,12 @@
               </w:rPr>
               <w:t>2</w:t>
             </w:r>
-            <w:proofErr w:type="spellStart"/>
             <w:r>
               <w:rPr>
                 <w:vertAlign w:val="superscript"/>
               </w:rPr>
               <w:t>nd</w:t>
             </w:r>
-            <w:proofErr w:type="spellEnd"/>
             <w:r>
               <w:t xml:space="preserve"> genitive plural</w:t>
             </w:r>
@@ -3130,11 +2964,9 @@
             <w:tcW w:w="525" w:type="dxa"/>
           </w:tcPr>
           <w:p>
-            <w:proofErr w:type="spellStart"/>
             <w:r>
               <w:t>ans</w:t>
             </w:r>
-            <w:proofErr w:type="spellEnd"/>
           </w:p>
         </w:tc>
         <w:tc>
@@ -3192,13 +3024,8 @@
           </w:p>
           <w:p>
             <w:r>
-              <w:t xml:space="preserve">nom sing </w:t>
-            </w:r>
-            <w:proofErr w:type="spellStart"/>
-            <w:r>
-              <w:t>masc</w:t>
-            </w:r>
-            <w:proofErr w:type="spellEnd"/>
+              <w:t>nom sing masc</w:t>
+            </w:r>
           </w:p>
         </w:tc>
         <w:tc>
@@ -3330,11 +3157,9 @@
             <w:tcW w:w="525" w:type="dxa"/>
           </w:tcPr>
           <w:p>
-            <w:proofErr w:type="spellStart"/>
             <w:r>
               <w:t>ans</w:t>
             </w:r>
-            <w:proofErr w:type="spellEnd"/>
           </w:p>
         </w:tc>
         <w:tc>
@@ -3428,13 +3253,8 @@
               </w:rPr>
               <w:t>σ</w:t>
             </w:r>
-            <w:proofErr w:type="spellStart"/>
-            <w:r>
-              <w:t>tead</w:t>
-            </w:r>
-            <w:proofErr w:type="spellEnd"/>
-            <w:r>
-              <w:t xml:space="preserve"> of </w:t>
+            <w:r>
+              <w:t xml:space="preserve">tead of </w:t>
             </w:r>
             <w:r>
               <w:rPr>
@@ -3553,11 +3373,9 @@
             <w:tcW w:w="525" w:type="dxa"/>
           </w:tcPr>
           <w:p>
-            <w:proofErr w:type="spellStart"/>
             <w:r>
               <w:t>ans</w:t>
             </w:r>
-            <w:proofErr w:type="spellEnd"/>
           </w:p>
         </w:tc>
         <w:tc>
@@ -3643,26 +3461,52 @@
                 <w:i/>
                 <w:iCs/>
               </w:rPr>
-              <w:t>π</w:t>
-            </w:r>
-            <w:proofErr w:type="spellStart"/>
+              <w:t>πληρόω</w:t>
+            </w:r>
+            <w:r>
+              <w:t> to </w:t>
+            </w:r>
+            <w:r>
+              <w:rPr>
+                <w:b/>
+                <w:bCs/>
+              </w:rPr>
+              <w:t>omega (ω)</w:t>
+            </w:r>
+            <w:r>
+              <w:t> in </w:t>
+            </w:r>
             <w:r>
               <w:rPr>
                 <w:i/>
                 <w:iCs/>
               </w:rPr>
-              <w:t>ληρόω</w:t>
-            </w:r>
-            <w:proofErr w:type="spellEnd"/>
-            <w:r>
-              <w:t> to </w:t>
+              <w:t>ἐπλήρωσεν</w:t>
+            </w:r>
+            <w:r>
+              <w:t> is due to a standard morphological rule for </w:t>
             </w:r>
             <w:r>
               <w:rPr>
                 <w:b/>
                 <w:bCs/>
               </w:rPr>
-              <w:t>omega (ω)</w:t>
+              <w:t>contract verbs</w:t>
+            </w:r>
+            <w:r>
+              <w:t>.</w:t>
+            </w:r>
+          </w:p>
+          <w:p>
+            <w:r>
+              <w:t>In Greek, when a verb stem ends in a short vowel (like the </w:t>
+            </w:r>
+            <w:r>
+              <w:rPr>
+                <w:b/>
+                <w:bCs/>
+              </w:rPr>
+              <w:t>-ο</w:t>
             </w:r>
             <w:r>
               <w:t> in </w:t>
@@ -3672,67 +3516,7 @@
                 <w:i/>
                 <w:iCs/>
               </w:rPr>
-              <w:t>ἐπ</w:t>
-            </w:r>
-            <w:proofErr w:type="spellStart"/>
-            <w:r>
-              <w:rPr>
-                <w:i/>
-                <w:iCs/>
-              </w:rPr>
-              <w:t>λήρωσεν</w:t>
-            </w:r>
-            <w:proofErr w:type="spellEnd"/>
-            <w:r>
-              <w:t> is due to a standard morphological rule for </w:t>
-            </w:r>
-            <w:r>
-              <w:rPr>
-                <w:b/>
-                <w:bCs/>
-              </w:rPr>
-              <w:t>contract verbs</w:t>
-            </w:r>
-            <w:r>
-              <w:t>.</w:t>
-            </w:r>
-          </w:p>
-          <w:p>
-            <w:r>
-              <w:t>In Greek, when a verb stem ends in a short vowel (like the </w:t>
-            </w:r>
-            <w:r>
-              <w:rPr>
-                <w:b/>
-                <w:bCs/>
-              </w:rPr>
-              <w:t>-ο</w:t>
-            </w:r>
-            <w:r>
-              <w:t> in </w:t>
-            </w:r>
-            <w:r>
-              <w:rPr>
-                <w:i/>
-                <w:iCs/>
-              </w:rPr>
-              <w:t>π</w:t>
-            </w:r>
-            <w:proofErr w:type="spellStart"/>
-            <w:r>
-              <w:rPr>
-                <w:i/>
-                <w:iCs/>
-              </w:rPr>
-              <w:t>ληρο</w:t>
-            </w:r>
-            <w:proofErr w:type="spellEnd"/>
-            <w:r>
-              <w:rPr>
-                <w:i/>
-                <w:iCs/>
-              </w:rPr>
-              <w:t>-</w:t>
+              <w:t>πληρο-</w:t>
             </w:r>
             <w:r>
               <w:t>), that vowel must </w:t>
@@ -3874,11 +3658,9 @@
             <w:tcW w:w="525" w:type="dxa"/>
           </w:tcPr>
           <w:p>
-            <w:proofErr w:type="spellStart"/>
             <w:r>
               <w:t>ans</w:t>
             </w:r>
-            <w:proofErr w:type="spellEnd"/>
           </w:p>
         </w:tc>
         <w:tc>
@@ -4091,11 +3873,9 @@
             <w:tcW w:w="525" w:type="dxa"/>
           </w:tcPr>
           <w:p>
-            <w:proofErr w:type="spellStart"/>
             <w:r>
               <w:t>ans</w:t>
             </w:r>
-            <w:proofErr w:type="spellEnd"/>
           </w:p>
         </w:tc>
         <w:tc>
@@ -4215,11 +3995,9 @@
             <w:r>
               <w:t xml:space="preserve"> plural aorist passive indicative of </w:t>
             </w:r>
-            <w:proofErr w:type="spellStart"/>
             <w:r>
               <w:t>ἀνοίγω</w:t>
             </w:r>
-            <w:proofErr w:type="spellEnd"/>
             <w:r>
               <w:t xml:space="preserve"> </w:t>
             </w:r>
@@ -4319,11 +4097,9 @@
                 <w:lang w:val="el-GR"/>
               </w:rPr>
             </w:pPr>
-            <w:proofErr w:type="spellStart"/>
             <w:r>
               <w:t>ans</w:t>
             </w:r>
-            <w:proofErr w:type="spellEnd"/>
           </w:p>
         </w:tc>
         <w:tc>
@@ -4333,23 +4109,7 @@
           </w:tcPr>
           <w:p>
             <w:r>
-              <w:t xml:space="preserve">and </w:t>
-            </w:r>
-            <w:proofErr w:type="gramStart"/>
-            <w:r>
-              <w:t>the</w:t>
-            </w:r>
-            <w:proofErr w:type="gramEnd"/>
-            <w:r>
-              <w:t xml:space="preserve"> </w:t>
-            </w:r>
-            <w:proofErr w:type="gramStart"/>
-            <w:r>
-              <w:t>eyes of them</w:t>
-            </w:r>
-            <w:proofErr w:type="gramEnd"/>
-            <w:r>
-              <w:t xml:space="preserve"> were</w:t>
+              <w:t>and the eyes of them were</w:t>
             </w:r>
             <w:r>
               <w:t xml:space="preserve"> opened.</w:t>
@@ -4538,7 +4298,6 @@
             <w:hideMark/>
           </w:tcPr>
           <w:p>
-            <w:proofErr w:type="spellStart"/>
             <w:r>
               <w:rPr>
                 <w:b/>
@@ -4546,7 +4305,6 @@
               </w:rPr>
               <w:t>ἀνοίγω</w:t>
             </w:r>
-            <w:proofErr w:type="spellEnd"/>
           </w:p>
         </w:tc>
         <w:tc>
@@ -4610,21 +4368,12 @@
             <w:hideMark/>
           </w:tcPr>
           <w:p>
-            <w:proofErr w:type="spellStart"/>
             <w:r>
               <w:rPr>
                 <w:b/>
                 <w:bCs/>
               </w:rPr>
-              <w:t>ἠν</w:t>
-            </w:r>
-            <w:proofErr w:type="spellEnd"/>
-            <w:r>
-              <w:rPr>
-                <w:b/>
-                <w:bCs/>
-              </w:rPr>
-              <w:t>α-οίγω</w:t>
+              <w:t>ἠνα-οίγω</w:t>
             </w:r>
           </w:p>
         </w:tc>
@@ -4689,7 +4438,6 @@
             <w:hideMark/>
           </w:tcPr>
           <w:p>
-            <w:proofErr w:type="spellStart"/>
             <w:r>
               <w:rPr>
                 <w:b/>
@@ -4697,7 +4445,6 @@
               </w:rPr>
               <w:t>ἠνε-οίγω</w:t>
             </w:r>
-            <w:proofErr w:type="spellEnd"/>
           </w:p>
         </w:tc>
         <w:tc>
@@ -4752,7 +4499,6 @@
             <w:hideMark/>
           </w:tcPr>
           <w:p>
-            <w:proofErr w:type="spellStart"/>
             <w:r>
               <w:rPr>
                 <w:b/>
@@ -4760,7 +4506,6 @@
               </w:rPr>
               <w:t>ἠνε-ῴγω</w:t>
             </w:r>
-            <w:proofErr w:type="spellEnd"/>
           </w:p>
         </w:tc>
         <w:tc>
@@ -4787,7 +4532,6 @@
             <w:r>
               <w:t>Root vowel (</w:t>
             </w:r>
-            <w:proofErr w:type="spellStart"/>
             <w:r>
               <w:rPr>
                 <w:i/>
@@ -4795,7 +4539,6 @@
               </w:rPr>
               <w:t>οι</w:t>
             </w:r>
-            <w:proofErr w:type="spellEnd"/>
             <w:r>
               <w:t>) lengthens to </w:t>
             </w:r>
@@ -4811,7 +4554,6 @@
             <w:r>
               <w:t>The rule governing the change from </w:t>
             </w:r>
-            <w:proofErr w:type="spellStart"/>
             <w:r>
               <w:rPr>
                 <w:b/>
@@ -4819,7 +4561,6 @@
               </w:rPr>
               <w:t>οι</w:t>
             </w:r>
-            <w:proofErr w:type="spellEnd"/>
             <w:r>
               <w:t> to </w:t>
             </w:r>
@@ -4933,21 +4674,12 @@
             <w:hideMark/>
           </w:tcPr>
           <w:p>
-            <w:proofErr w:type="spellStart"/>
             <w:r>
               <w:rPr>
                 <w:b/>
                 <w:bCs/>
               </w:rPr>
-              <w:t>ἠνεῳχ-θη</w:t>
-            </w:r>
-            <w:proofErr w:type="spellEnd"/>
-            <w:r>
-              <w:rPr>
-                <w:b/>
-                <w:bCs/>
-              </w:rPr>
-              <w:t>-</w:t>
+              <w:t>ἠνεῳχ-θη-</w:t>
             </w:r>
           </w:p>
         </w:tc>
@@ -5070,21 +4802,12 @@
             <w:hideMark/>
           </w:tcPr>
           <w:p>
-            <w:proofErr w:type="spellStart"/>
             <w:r>
               <w:rPr>
                 <w:b/>
                 <w:bCs/>
               </w:rPr>
-              <w:t>ἠνεῴχθησ</w:t>
-            </w:r>
-            <w:proofErr w:type="spellEnd"/>
-            <w:r>
-              <w:rPr>
-                <w:b/>
-                <w:bCs/>
-              </w:rPr>
-              <w:t>αν</w:t>
+              <w:t>ἠνεῴχθησαν</w:t>
             </w:r>
           </w:p>
         </w:tc>
@@ -5233,13 +4956,13 @@
               <w:rPr>
                 <w:lang w:val="el-GR"/>
               </w:rPr>
-              <w:t>ή</w:t>
-            </w:r>
-            <w:r>
-              <w:rPr>
-                <w:lang w:val="el-GR"/>
-              </w:rPr>
-              <w:t xml:space="preserve">ν </w:t>
+              <w:t>η</w:t>
+            </w:r>
+            <w:r>
+              <w:rPr>
+                <w:lang w:val="el-GR"/>
+              </w:rPr>
+              <w:t xml:space="preserve"> </w:t>
             </w:r>
             <w:r>
               <w:rPr>
@@ -5251,13 +4974,7 @@
               <w:rPr>
                 <w:lang w:val="el-GR"/>
               </w:rPr>
-              <w:t>ή</w:t>
-            </w:r>
-            <w:r>
-              <w:rPr>
-                <w:lang w:val="el-GR"/>
-              </w:rPr>
-              <w:t>ν</w:t>
+              <w:t>η</w:t>
             </w:r>
           </w:p>
         </w:tc>
@@ -5287,21 +5004,7 @@
               <w:rPr>
                 <w:sz w:val="18"/>
               </w:rPr>
-              <w:t xml:space="preserve">The teacher </w:t>
-            </w:r>
-            <w:proofErr w:type="gramStart"/>
-            <w:r>
-              <w:rPr>
-                <w:sz w:val="18"/>
-              </w:rPr>
-              <w:t>was gathering</w:t>
-            </w:r>
-            <w:proofErr w:type="gramEnd"/>
-            <w:r>
-              <w:rPr>
-                <w:sz w:val="18"/>
-              </w:rPr>
-              <w:t xml:space="preserve"> the disciples and taught them.</w:t>
+              <w:t>The teacher was gathering the disciples and taught them.</w:t>
             </w:r>
           </w:p>
           <w:p>
@@ -5375,7 +5078,6 @@
             <w:r>
               <w:t> In compound verbs like </w:t>
             </w:r>
-            <w:proofErr w:type="spellStart"/>
             <w:r>
               <w:rPr>
                 <w:i/>
@@ -5383,38 +5085,26 @@
               </w:rPr>
               <w:t>συνάγω</w:t>
             </w:r>
-            <w:proofErr w:type="spellEnd"/>
             <w:r>
               <w:t> (prefix </w:t>
             </w:r>
-            <w:proofErr w:type="spellStart"/>
             <w:r>
               <w:rPr>
                 <w:i/>
                 <w:iCs/>
               </w:rPr>
-              <w:t>συν</w:t>
-            </w:r>
-            <w:proofErr w:type="spellEnd"/>
+              <w:t>συν-</w:t>
+            </w:r>
+            <w:r>
+              <w:t> + </w:t>
+            </w:r>
             <w:r>
               <w:rPr>
                 <w:i/>
                 <w:iCs/>
               </w:rPr>
-              <w:t>-</w:t>
-            </w:r>
-            <w:r>
-              <w:t> + </w:t>
-            </w:r>
-            <w:proofErr w:type="spellStart"/>
-            <w:r>
-              <w:rPr>
-                <w:i/>
-                <w:iCs/>
-              </w:rPr>
               <w:t>ἄγω</w:t>
             </w:r>
-            <w:proofErr w:type="spellEnd"/>
             <w:r>
               <w:t>), the augment (ε) is inserted between the preposition and the verb stem.</w:t>
             </w:r>
@@ -5581,11 +5271,9 @@
             <w:r>
               <w:t xml:space="preserve">3rd person singular aorist active indicative of </w:t>
             </w:r>
-            <w:proofErr w:type="spellStart"/>
             <w:r>
               <w:t>δοξάζω</w:t>
             </w:r>
-            <w:proofErr w:type="spellEnd"/>
             <w:r>
               <w:t xml:space="preserve"> =</w:t>
             </w:r>
@@ -5990,17 +5678,8 @@
           <w:b/>
           <w:bCs/>
         </w:rPr>
-        <w:t>ὁ μα</w:t>
-      </w:r>
-      <w:proofErr w:type="spellStart"/>
-      <w:r>
-        <w:rPr>
-          <w:b/>
-          <w:bCs/>
-        </w:rPr>
-        <w:t>θητής</w:t>
-      </w:r>
-      <w:proofErr w:type="spellEnd"/>
+        <w:t>ὁ μαθητής</w:t>
+      </w:r>
       <w:r>
         <w:t> (the student)</w:t>
       </w:r>
@@ -6018,17 +5697,8 @@
           <w:bCs/>
         </w:rPr>
         <w:lastRenderedPageBreak/>
-        <w:t>ὁ π</w:t>
-      </w:r>
-      <w:proofErr w:type="spellStart"/>
-      <w:r>
-        <w:rPr>
-          <w:b/>
-          <w:bCs/>
-        </w:rPr>
-        <w:t>ροφήτης</w:t>
-      </w:r>
-      <w:proofErr w:type="spellEnd"/>
+        <w:t>ὁ προφήτης</w:t>
+      </w:r>
       <w:r>
         <w:t> (the prophet)</w:t>
       </w:r>
@@ -6045,23 +5715,7 @@
           <w:b/>
           <w:bCs/>
         </w:rPr>
-        <w:t xml:space="preserve">ὁ </w:t>
-      </w:r>
-      <w:proofErr w:type="spellStart"/>
-      <w:r>
-        <w:rPr>
-          <w:b/>
-          <w:bCs/>
-        </w:rPr>
-        <w:t>στρ</w:t>
-      </w:r>
-      <w:proofErr w:type="spellEnd"/>
-      <w:r>
-        <w:rPr>
-          <w:b/>
-          <w:bCs/>
-        </w:rPr>
-        <w:t>ατιώτης</w:t>
+        <w:t>ὁ στρατιώτης</w:t>
       </w:r>
       <w:r>
         <w:t> (the soldier)</w:t>
@@ -6079,29 +5733,1145 @@
           <w:b/>
           <w:bCs/>
         </w:rPr>
-        <w:t xml:space="preserve">ὁ </w:t>
-      </w:r>
-      <w:proofErr w:type="spellStart"/>
-      <w:r>
-        <w:rPr>
-          <w:b/>
-          <w:bCs/>
-        </w:rPr>
-        <w:t>νε</w:t>
-      </w:r>
-      <w:proofErr w:type="spellEnd"/>
-      <w:r>
-        <w:rPr>
-          <w:b/>
-          <w:bCs/>
-        </w:rPr>
-        <w:t>ανίας</w:t>
+        <w:t>ὁ νεανίας</w:t>
       </w:r>
       <w:r>
         <w:t> (the young man)</w:t>
       </w:r>
     </w:p>
     <w:p/>
+    <w:p/>
+    <w:p/>
+    <w:p>
+      <w:pPr>
+        <w:pStyle w:val="ListParagraph"/>
+        <w:numPr>
+          <w:ilvl w:val="0"/>
+          <w:numId w:val="3"/>
+        </w:numPr>
+        <w:rPr>
+          <w:lang w:val="el-GR"/>
+        </w:rPr>
+      </w:pPr>
+      <w:r>
+        <w:t xml:space="preserve">  </w:t>
+      </w:r>
+      <w:r>
+        <w:rPr>
+          <w:lang w:val="el-GR"/>
+        </w:rPr>
+        <w:t>αὐτος ἐπροσεύξεν ἐν  τη συναγωγη</w:t>
+      </w:r>
+    </w:p>
+    <w:p>
+      <w:r>
+        <w:rPr>
+          <w:lang w:val="el-GR"/>
+        </w:rPr>
+        <w:t>αὐτος</w:t>
+      </w:r>
+      <w:r>
+        <w:t xml:space="preserve"> </w:t>
+      </w:r>
+      <w:r>
+        <w:t>– 3</w:t>
+      </w:r>
+      <w:r>
+        <w:rPr>
+          <w:vertAlign w:val="superscript"/>
+        </w:rPr>
+        <w:t>rd</w:t>
+      </w:r>
+      <w:r>
+        <w:t xml:space="preserve"> person singular masculine nominative </w:t>
+      </w:r>
+    </w:p>
+    <w:p>
+      <w:r>
+        <w:rPr>
+          <w:lang w:val="el-GR"/>
+        </w:rPr>
+        <w:t>ἐ</w:t>
+      </w:r>
+      <w:r>
+        <w:rPr>
+          <w:lang w:val="el-GR"/>
+        </w:rPr>
+        <w:t>προσεύ</w:t>
+      </w:r>
+      <w:r>
+        <w:rPr>
+          <w:lang w:val="el-GR"/>
+        </w:rPr>
+        <w:t>ξεν</w:t>
+      </w:r>
+      <w:r>
+        <w:t xml:space="preserve"> </w:t>
+      </w:r>
+      <w:r>
+        <w:t>– 3</w:t>
+      </w:r>
+      <w:r>
+        <w:rPr>
+          <w:vertAlign w:val="superscript"/>
+        </w:rPr>
+        <w:t>rd</w:t>
+      </w:r>
+      <w:r>
+        <w:t xml:space="preserve"> person </w:t>
+      </w:r>
+      <w:r>
+        <w:t xml:space="preserve">singular </w:t>
+      </w:r>
+      <w:r>
+        <w:t xml:space="preserve">active aorist indicative of </w:t>
+      </w:r>
+      <w:r>
+        <w:t>προσεύχομαι</w:t>
+      </w:r>
+      <w:r>
+        <w:t xml:space="preserve">.  The </w:t>
+      </w:r>
+      <w:r>
+        <w:rPr>
+          <w:lang w:val="el-GR"/>
+        </w:rPr>
+        <w:t>χ</w:t>
+      </w:r>
+      <w:r>
+        <w:t xml:space="preserve"> </w:t>
+      </w:r>
+      <w:r>
+        <w:t xml:space="preserve">combines with </w:t>
+      </w:r>
+      <w:r>
+        <w:t xml:space="preserve"> </w:t>
+      </w:r>
+      <w:r>
+        <w:rPr>
+          <w:lang w:val="el-GR"/>
+        </w:rPr>
+        <w:t>σ</w:t>
+      </w:r>
+      <w:r>
+        <w:t xml:space="preserve">  </w:t>
+      </w:r>
+      <w:r>
+        <w:t xml:space="preserve">in </w:t>
+      </w:r>
+      <w:r>
+        <w:rPr>
+          <w:lang w:val="el-GR"/>
+        </w:rPr>
+        <w:t>σεν</w:t>
+      </w:r>
+      <w:r>
+        <w:t xml:space="preserve"> </w:t>
+      </w:r>
+      <w:r>
+        <w:t xml:space="preserve">resulting in </w:t>
+      </w:r>
+      <w:r>
+        <w:rPr>
+          <w:lang w:val="el-GR"/>
+        </w:rPr>
+        <w:t>ξ</w:t>
+      </w:r>
+      <w:r>
+        <w:t xml:space="preserve"> (</w:t>
+      </w:r>
+      <w:r>
+        <w:t xml:space="preserve">a stem variation that allows for easier pronunciation than </w:t>
+      </w:r>
+      <w:r>
+        <w:rPr>
+          <w:lang w:val="el-GR"/>
+        </w:rPr>
+        <w:t>χσ</w:t>
+      </w:r>
+      <w:r>
+        <w:t>)</w:t>
+      </w:r>
+    </w:p>
+    <w:p>
+      <w:r>
+        <w:rPr>
+          <w:lang w:val="el-GR"/>
+        </w:rPr>
+        <w:t>ἐν</w:t>
+      </w:r>
+      <w:r>
+        <w:t xml:space="preserve"> </w:t>
+      </w:r>
+      <w:r>
+        <w:t>– ( in,on,at,by,with)</w:t>
+      </w:r>
+    </w:p>
+    <w:p>
+      <w:r>
+        <w:t xml:space="preserve"> </w:t>
+      </w:r>
+      <w:r>
+        <w:rPr>
+          <w:lang w:val="el-GR"/>
+        </w:rPr>
+        <w:t>τ</w:t>
+      </w:r>
+      <w:r>
+        <w:rPr>
+          <w:lang w:val="el-GR"/>
+        </w:rPr>
+        <w:t>η</w:t>
+      </w:r>
+      <w:r>
+        <w:t xml:space="preserve"> </w:t>
+      </w:r>
+      <w:r>
+        <w:rPr>
+          <w:lang w:val="el-GR"/>
+        </w:rPr>
+        <w:t>συναγωγ</w:t>
+      </w:r>
+      <w:r>
+        <w:rPr>
+          <w:lang w:val="el-GR"/>
+        </w:rPr>
+        <w:t>η</w:t>
+      </w:r>
+      <w:r>
+        <w:t xml:space="preserve"> – singular dative of  </w:t>
+      </w:r>
+      <w:r>
+        <w:rPr>
+          <w:lang w:val="el-GR"/>
+        </w:rPr>
+        <w:t>ἡ</w:t>
+      </w:r>
+      <w:r>
+        <w:t>συναγωγή</w:t>
+      </w:r>
+      <w:r>
+        <w:t xml:space="preserve"> (assembly)</w:t>
+      </w:r>
+    </w:p>
+    <w:p/>
+    <w:p>
+      <w:pPr>
+        <w:pStyle w:val="ListParagraph"/>
+        <w:numPr>
+          <w:ilvl w:val="0"/>
+          <w:numId w:val="3"/>
+        </w:numPr>
+        <w:rPr>
+          <w:lang w:val="el-GR"/>
+        </w:rPr>
+      </w:pPr>
+      <w:r>
+        <w:t xml:space="preserve"> </w:t>
+      </w:r>
+      <w:r>
+        <w:rPr>
+          <w:lang w:val="el-GR"/>
+        </w:rPr>
+        <w:t>ὁ διδασκαλος συνηγεν τόυς  μαθητας</w:t>
+      </w:r>
+      <w:r>
+        <w:rPr>
+          <w:vertAlign w:val="superscript"/>
+          <w:lang w:val="el-GR"/>
+        </w:rPr>
+        <w:softHyphen/>
+      </w:r>
+      <w:r>
+        <w:rPr>
+          <w:vertAlign w:val="superscript"/>
+          <w:lang w:val="el-GR"/>
+        </w:rPr>
+        <w:softHyphen/>
+        <w:t xml:space="preserve"> </w:t>
+      </w:r>
+      <w:r>
+        <w:rPr>
+          <w:lang w:val="el-GR"/>
+        </w:rPr>
+        <w:t>και ἐδιδαξεν αὐτους</w:t>
+      </w:r>
+    </w:p>
+    <w:p>
+      <w:pPr>
+        <w:pStyle w:val="ListParagraph"/>
+        <w:ind w:left="360"/>
+        <w:rPr>
+          <w:lang w:val="el-GR"/>
+        </w:rPr>
+      </w:pPr>
+    </w:p>
+    <w:p>
+      <w:pPr>
+        <w:pStyle w:val="ListParagraph"/>
+        <w:ind w:left="360"/>
+      </w:pPr>
+      <w:r>
+        <w:rPr>
+          <w:lang w:val="el-GR"/>
+        </w:rPr>
+        <w:t>ὁ</w:t>
+      </w:r>
+      <w:r>
+        <w:t xml:space="preserve"> </w:t>
+      </w:r>
+      <w:r>
+        <w:rPr>
+          <w:lang w:val="el-GR"/>
+        </w:rPr>
+        <w:t>διδασκαλος</w:t>
+      </w:r>
+      <w:r>
+        <w:t xml:space="preserve">  - singular nominative (the teacher)</w:t>
+      </w:r>
+    </w:p>
+    <w:p>
+      <w:pPr>
+        <w:pStyle w:val="ListParagraph"/>
+        <w:ind w:left="360"/>
+      </w:pPr>
+      <w:r>
+        <w:t xml:space="preserve"> </w:t>
+      </w:r>
+      <w:r>
+        <w:t xml:space="preserve">  Then the </w:t>
+      </w:r>
+      <w:r>
+        <w:rPr>
+          <w:lang w:val="el-GR"/>
+        </w:rPr>
+        <w:t>ε</w:t>
+      </w:r>
+      <w:r>
+        <w:t xml:space="preserve"> </w:t>
+      </w:r>
+      <w:r>
+        <w:t xml:space="preserve">augment combines with the </w:t>
+      </w:r>
+      <w:r>
+        <w:rPr>
+          <w:lang w:val="el-GR"/>
+        </w:rPr>
+        <w:t>α</w:t>
+      </w:r>
+      <w:r>
+        <w:t xml:space="preserve"> </w:t>
+      </w:r>
+      <w:r>
+        <w:t xml:space="preserve">to become </w:t>
+      </w:r>
+      <w:r>
+        <w:rPr>
+          <w:lang w:val="el-GR"/>
+        </w:rPr>
+        <w:t>η</w:t>
+      </w:r>
+      <w:r>
+        <w:t xml:space="preserve">.  </w:t>
+      </w:r>
+      <w:r>
+        <w:t xml:space="preserve">This is different from the rules for contract verbs that we studied where </w:t>
+      </w:r>
+      <w:r>
+        <w:rPr>
+          <w:lang w:val="el-GR"/>
+        </w:rPr>
+        <w:t>ε</w:t>
+      </w:r>
+      <w:r>
+        <w:t xml:space="preserve"> </w:t>
+      </w:r>
+      <w:r>
+        <w:t>+</w:t>
+      </w:r>
+      <w:r>
+        <w:rPr>
+          <w:lang w:val="el-GR"/>
+        </w:rPr>
+        <w:t>α</w:t>
+      </w:r>
+      <w:r>
+        <w:t xml:space="preserve"> </w:t>
+      </w:r>
+      <w:r>
+        <w:t xml:space="preserve">combines to become </w:t>
+      </w:r>
+      <w:r>
+        <w:rPr>
+          <w:lang w:val="el-GR"/>
+        </w:rPr>
+        <w:t>α</w:t>
+      </w:r>
+      <w:r>
+        <w:t>.</w:t>
+      </w:r>
+    </w:p>
+    <w:p>
+      <w:pPr>
+        <w:pStyle w:val="ListParagraph"/>
+        <w:ind w:left="360"/>
+      </w:pPr>
+    </w:p>
+    <w:p>
+      <w:pPr>
+        <w:pStyle w:val="ListParagraph"/>
+        <w:ind w:left="360"/>
+      </w:pPr>
+    </w:p>
+    <w:p>
+      <w:pPr>
+        <w:pStyle w:val="ListParagraph"/>
+        <w:ind w:left="360"/>
+      </w:pPr>
+      <w:r>
+        <w:rPr>
+          <w:lang w:val="el-GR"/>
+        </w:rPr>
+        <w:t>τόυς</w:t>
+      </w:r>
+      <w:r>
+        <w:t xml:space="preserve"> </w:t>
+      </w:r>
+      <w:r>
+        <w:rPr>
+          <w:lang w:val="el-GR"/>
+        </w:rPr>
+        <w:t>μαθητας</w:t>
+      </w:r>
+      <w:r>
+        <w:t xml:space="preserve">  - </w:t>
+      </w:r>
+      <w:r>
+        <w:t xml:space="preserve">masculine plural accusative of </w:t>
+      </w:r>
+      <w:r>
+        <w:rPr>
+          <w:lang w:val="el-GR"/>
+        </w:rPr>
+        <w:t>ὁ</w:t>
+      </w:r>
+      <w:r>
+        <w:t xml:space="preserve"> </w:t>
+      </w:r>
+      <w:r>
+        <w:rPr>
+          <w:lang w:val="el-GR"/>
+        </w:rPr>
+        <w:t>μα</w:t>
+      </w:r>
+      <w:r>
+        <w:rPr>
+          <w:lang w:val="el-GR"/>
+        </w:rPr>
+        <w:t>θητης</w:t>
+      </w:r>
+      <w:r>
+        <w:t xml:space="preserve"> (even though</w:t>
+      </w:r>
+      <w:r>
+        <w:t xml:space="preserve"> </w:t>
+      </w:r>
+      <w:r>
+        <w:t>the noun is masculine it follows the eta pattern)</w:t>
+      </w:r>
+      <w:r>
+        <w:br/>
+        <w:t>https://www.ntgreek.net/lesson15.htm#:~:text=Masculine%20Nouns%20of%20the%201st,develop%20that%20a%20bit%20more.</w:t>
+      </w:r>
+    </w:p>
+    <w:p>
+      <w:pPr>
+        <w:pStyle w:val="ListParagraph"/>
+        <w:ind w:left="360"/>
+      </w:pPr>
+    </w:p>
+    <w:p>
+      <w:pPr>
+        <w:pStyle w:val="ListParagraph"/>
+        <w:ind w:left="360"/>
+      </w:pPr>
+      <w:r>
+        <w:t xml:space="preserve">  </w:t>
+      </w:r>
+      <w:r>
+        <w:rPr>
+          <w:lang w:val="el-GR"/>
+        </w:rPr>
+        <w:t>και</w:t>
+      </w:r>
+      <w:r>
+        <w:t xml:space="preserve"> – (and,but)</w:t>
+      </w:r>
+    </w:p>
+    <w:p>
+      <w:pPr>
+        <w:pStyle w:val="ListParagraph"/>
+        <w:ind w:left="360"/>
+      </w:pPr>
+    </w:p>
+    <w:p>
+      <w:pPr>
+        <w:pStyle w:val="ListParagraph"/>
+        <w:ind w:left="360"/>
+      </w:pPr>
+      <w:r>
+        <w:t xml:space="preserve"> </w:t>
+      </w:r>
+      <w:r>
+        <w:rPr>
+          <w:lang w:val="el-GR"/>
+        </w:rPr>
+        <w:t>ἐδιδαξεν</w:t>
+      </w:r>
+      <w:r>
+        <w:t xml:space="preserve"> </w:t>
+      </w:r>
+      <w:r>
+        <w:t>-3</w:t>
+      </w:r>
+      <w:r>
+        <w:rPr>
+          <w:vertAlign w:val="superscript"/>
+        </w:rPr>
+        <w:t>rd</w:t>
+      </w:r>
+      <w:r>
+        <w:t xml:space="preserve"> person</w:t>
+      </w:r>
+      <w:r>
+        <w:t xml:space="preserve"> singular aorist indicative of </w:t>
+      </w:r>
+      <w:r>
+        <w:rPr>
+          <w:lang w:val="el-GR"/>
+        </w:rPr>
+        <w:t>διδασκω</w:t>
+      </w:r>
+      <w:r>
+        <w:t xml:space="preserve"> </w:t>
+      </w:r>
+      <w:r>
+        <w:t xml:space="preserve">where </w:t>
+      </w:r>
+      <w:r>
+        <w:rPr>
+          <w:lang w:val="el-GR"/>
+        </w:rPr>
+        <w:t>σκ</w:t>
+      </w:r>
+      <w:r>
+        <w:t xml:space="preserve">  </w:t>
+      </w:r>
+      <w:r>
+        <w:t>combines with</w:t>
+      </w:r>
+      <w:r>
+        <w:t xml:space="preserve"> </w:t>
+      </w:r>
+      <w:r>
+        <w:rPr>
+          <w:lang w:val="el-GR"/>
+        </w:rPr>
+        <w:t>σ</w:t>
+      </w:r>
+      <w:r>
+        <w:t xml:space="preserve"> in -</w:t>
+      </w:r>
+      <w:r>
+        <w:rPr>
+          <w:lang w:val="el-GR"/>
+        </w:rPr>
+        <w:t>σεν</w:t>
+      </w:r>
+      <w:r>
+        <w:t xml:space="preserve"> </w:t>
+      </w:r>
+      <w:r>
+        <w:t xml:space="preserve">to produce </w:t>
+      </w:r>
+      <w:r>
+        <w:rPr>
+          <w:lang w:val="el-GR"/>
+        </w:rPr>
+        <w:t>ξ</w:t>
+      </w:r>
+      <w:r>
+        <w:t xml:space="preserve"> </w:t>
+      </w:r>
+      <w:r>
+        <w:t xml:space="preserve">which is easier to pronounce </w:t>
+      </w:r>
+    </w:p>
+    <w:p>
+      <w:pPr>
+        <w:pStyle w:val="ListParagraph"/>
+        <w:ind w:left="360"/>
+      </w:pPr>
+    </w:p>
+    <w:p>
+      <w:pPr>
+        <w:pStyle w:val="ListParagraph"/>
+        <w:ind w:left="360"/>
+      </w:pPr>
+      <w:r>
+        <w:t xml:space="preserve"> </w:t>
+      </w:r>
+      <w:r>
+        <w:rPr>
+          <w:lang w:val="el-GR"/>
+        </w:rPr>
+        <w:t>αὐτους</w:t>
+      </w:r>
+      <w:r>
+        <w:t xml:space="preserve">  - 3</w:t>
+      </w:r>
+      <w:r>
+        <w:rPr>
+          <w:vertAlign w:val="superscript"/>
+        </w:rPr>
+        <w:t>rd</w:t>
+      </w:r>
+      <w:r>
+        <w:t xml:space="preserve"> person plural masculine (them)</w:t>
+      </w:r>
+    </w:p>
+    <w:p>
+      <w:pPr>
+        <w:pStyle w:val="ListParagraph"/>
+        <w:numPr>
+          <w:ilvl w:val="0"/>
+          <w:numId w:val="3"/>
+        </w:numPr>
+      </w:pPr>
+      <w:r>
+        <w:t xml:space="preserve"> </w:t>
+      </w:r>
+      <w:r>
+        <w:rPr>
+          <w:lang w:val="el-GR"/>
+        </w:rPr>
+        <w:t>ὁ</w:t>
+      </w:r>
+      <w:r>
+        <w:t xml:space="preserve"> </w:t>
+      </w:r>
+      <w:r>
+        <w:rPr>
+          <w:lang w:val="el-GR"/>
+        </w:rPr>
+        <w:t>αγγελος</w:t>
+      </w:r>
+      <w:r>
+        <w:t xml:space="preserve"> </w:t>
+      </w:r>
+      <w:r>
+        <w:t>– 1</w:t>
+      </w:r>
+      <w:r>
+        <w:rPr>
+          <w:vertAlign w:val="superscript"/>
+        </w:rPr>
+        <w:t>st</w:t>
+      </w:r>
+      <w:r>
+        <w:t xml:space="preserve"> person singular nominative (the angel)</w:t>
+      </w:r>
+    </w:p>
+    <w:p>
+      <w:r>
+        <w:rPr>
+          <w:lang w:val="el-GR"/>
+        </w:rPr>
+        <w:t>ἐδοξασεν</w:t>
+      </w:r>
+      <w:r>
+        <w:t xml:space="preserve"> </w:t>
+      </w:r>
+      <w:r>
+        <w:t xml:space="preserve"> - aorist 3</w:t>
+      </w:r>
+      <w:r>
+        <w:rPr>
+          <w:vertAlign w:val="superscript"/>
+        </w:rPr>
+        <w:t>rd</w:t>
+      </w:r>
+      <w:r>
+        <w:t xml:space="preserve"> person singular of </w:t>
+      </w:r>
+      <w:r>
+        <w:t xml:space="preserve">δοξάζω </w:t>
+      </w:r>
+      <w:r>
+        <w:t>( I glorify)</w:t>
+      </w:r>
+    </w:p>
+    <w:p>
+      <w:r>
+        <w:rPr>
+          <w:lang w:val="el-GR"/>
+        </w:rPr>
+        <w:lastRenderedPageBreak/>
+        <w:t>Θεον</w:t>
+      </w:r>
+      <w:r>
+        <w:t xml:space="preserve"> –</w:t>
+      </w:r>
+      <w:r>
+        <w:t>singular accusative (God)</w:t>
+      </w:r>
+    </w:p>
+    <w:p>
+      <w:pPr>
+        <w:rPr>
+          <w:rFonts w:ascii="Calibri" w:eastAsia="Times New Roman" w:hAnsi="Calibri" w:cs="Calibri"/>
+          <w:color w:val="000000"/>
+          <w:sz w:val="48"/>
+          <w:szCs w:val="48"/>
+        </w:rPr>
+      </w:pPr>
+      <w:r>
+        <w:rPr>
+          <w:lang w:val="el-GR"/>
+        </w:rPr>
+        <w:t>ἐνωπιον</w:t>
+      </w:r>
+      <w:r>
+        <w:t xml:space="preserve"> </w:t>
+      </w:r>
+      <w:r>
+        <w:t xml:space="preserve">– genitive (before, in the presence of) </w:t>
+      </w:r>
+    </w:p>
+    <w:p>
+      <w:r>
+        <w:rPr>
+          <w:lang w:val="el-GR"/>
+        </w:rPr>
+        <w:t>αὐτου</w:t>
+      </w:r>
+      <w:r>
+        <w:t xml:space="preserve"> </w:t>
+      </w:r>
+      <w:r>
+        <w:t>–</w:t>
+      </w:r>
+      <w:r>
+        <w:t xml:space="preserve"> </w:t>
+      </w:r>
+      <w:r>
+        <w:t>3</w:t>
+      </w:r>
+      <w:r>
+        <w:rPr>
+          <w:vertAlign w:val="superscript"/>
+        </w:rPr>
+        <w:t>rd</w:t>
+      </w:r>
+      <w:r>
+        <w:t xml:space="preserve"> person singular genitive</w:t>
+      </w:r>
+    </w:p>
+    <w:p>
+      <w:r>
+        <w:rPr>
+          <w:lang w:val="el-GR"/>
+        </w:rPr>
+        <w:t>θρονου</w:t>
+      </w:r>
+      <w:r>
+        <w:t xml:space="preserve"> – singular genitive of </w:t>
+      </w:r>
+      <w:r>
+        <w:rPr>
+          <w:lang w:val="el-GR"/>
+        </w:rPr>
+        <w:t>θρονος</w:t>
+      </w:r>
+    </w:p>
+    <w:p/>
+    <w:p>
+      <w:pPr>
+        <w:pStyle w:val="ListParagraph"/>
+        <w:numPr>
+          <w:ilvl w:val="0"/>
+          <w:numId w:val="3"/>
+        </w:numPr>
+        <w:rPr>
+          <w:sz w:val="18"/>
+        </w:rPr>
+      </w:pPr>
+      <w:r>
+        <w:rPr>
+          <w:lang w:val="el-GR"/>
+        </w:rPr>
+        <w:t>ἡμεις</w:t>
+      </w:r>
+      <w:r>
+        <w:t xml:space="preserve"> </w:t>
+      </w:r>
+      <w:r>
+        <w:t>– 1</w:t>
+      </w:r>
+      <w:r>
+        <w:rPr>
+          <w:vertAlign w:val="superscript"/>
+        </w:rPr>
+        <w:t>st</w:t>
+      </w:r>
+      <w:r>
+        <w:t xml:space="preserve"> </w:t>
+      </w:r>
+      <w:r>
+        <w:t>person</w:t>
+      </w:r>
+      <w:r>
+        <w:t xml:space="preserve"> </w:t>
+      </w:r>
+      <w:r>
+        <w:t>nominative</w:t>
+      </w:r>
+      <w:r>
+        <w:t xml:space="preserve"> </w:t>
+      </w:r>
+      <w:r>
+        <w:t>plural</w:t>
+      </w:r>
+      <w:r>
+        <w:t xml:space="preserve"> (</w:t>
+      </w:r>
+      <w:r>
+        <w:t>we</w:t>
+      </w:r>
+      <w:r>
+        <w:t>)</w:t>
+      </w:r>
+      <w:r>
+        <w:br/>
+      </w:r>
+      <w:r>
+        <w:br/>
+      </w:r>
+      <w:r>
+        <w:rPr>
+          <w:lang w:val="el-GR"/>
+        </w:rPr>
+        <w:t>οὐκ</w:t>
+      </w:r>
+      <w:r>
+        <w:t xml:space="preserve"> </w:t>
+      </w:r>
+      <w:r>
+        <w:t xml:space="preserve">– </w:t>
+      </w:r>
+      <w:r>
+        <w:t>because</w:t>
+      </w:r>
+      <w:r>
+        <w:t xml:space="preserve"> </w:t>
+      </w:r>
+      <w:r>
+        <w:t>verb</w:t>
+      </w:r>
+      <w:r>
+        <w:t xml:space="preserve"> </w:t>
+      </w:r>
+      <w:r>
+        <w:t>begin</w:t>
+      </w:r>
+      <w:r>
+        <w:t xml:space="preserve">s </w:t>
+      </w:r>
+      <w:r>
+        <w:t>with</w:t>
+      </w:r>
+      <w:r>
+        <w:t xml:space="preserve"> </w:t>
+      </w:r>
+      <w:r>
+        <w:t>a</w:t>
+      </w:r>
+      <w:r>
+        <w:t xml:space="preserve"> </w:t>
+      </w:r>
+      <w:r>
+        <w:t xml:space="preserve">vowel with a </w:t>
+      </w:r>
+      <w:r>
+        <w:t>smooth</w:t>
+      </w:r>
+      <w:r>
+        <w:t xml:space="preserve"> </w:t>
+      </w:r>
+      <w:r>
+        <w:t>breathing</w:t>
+      </w:r>
+      <w:r>
+        <w:t xml:space="preserve"> mark (chapter 6)</w:t>
+      </w:r>
+      <w:r>
+        <w:br/>
+      </w:r>
+      <w:r>
+        <w:br/>
+      </w:r>
+      <w:r>
+        <w:rPr>
+          <w:lang w:val="el-GR"/>
+        </w:rPr>
+        <w:t>επισ</w:t>
+      </w:r>
+      <w:r>
+        <w:t>t</w:t>
+      </w:r>
+      <w:r>
+        <w:rPr>
+          <w:lang w:val="el-GR"/>
+        </w:rPr>
+        <w:t>ευ</w:t>
+      </w:r>
+      <w:r>
+        <w:t>so</w:t>
+      </w:r>
+      <w:r>
+        <w:rPr>
+          <w:lang w:val="el-GR"/>
+        </w:rPr>
+        <w:t>μεν</w:t>
+      </w:r>
+      <w:r>
+        <w:t xml:space="preserve"> </w:t>
+      </w:r>
+      <w:r>
+        <w:t xml:space="preserve">- </w:t>
+      </w:r>
+      <w:r>
+        <w:t xml:space="preserve">1st person plural aorist active indicative of </w:t>
+      </w:r>
+      <w:r>
+        <w:rPr>
+          <w:lang w:val="el-GR"/>
+        </w:rPr>
+        <w:t>πισευω</w:t>
+      </w:r>
+      <w:r>
+        <w:rPr>
+          <w:sz w:val="18"/>
+        </w:rPr>
+        <w:t xml:space="preserve">  </w:t>
+      </w:r>
+      <w:r>
+        <w:rPr>
+          <w:sz w:val="18"/>
+        </w:rPr>
+        <w:br/>
+      </w:r>
+      <w:r>
+        <w:br/>
+      </w:r>
+      <w:r>
+        <w:rPr>
+          <w:lang w:val="el-GR"/>
+        </w:rPr>
+        <w:t>το</w:t>
+      </w:r>
+      <w:r>
+        <w:t xml:space="preserve"> </w:t>
+      </w:r>
+      <w:r>
+        <w:rPr>
+          <w:lang w:val="el-GR"/>
+        </w:rPr>
+        <w:t>δαιμονιον</w:t>
+      </w:r>
+      <w:r>
+        <w:t xml:space="preserve"> -  singular accusative</w:t>
+      </w:r>
+    </w:p>
+    <w:p/>
+    <w:p>
+      <w:pPr>
+        <w:pStyle w:val="ListParagraph"/>
+        <w:numPr>
+          <w:ilvl w:val="0"/>
+          <w:numId w:val="3"/>
+        </w:numPr>
+        <w:rPr>
+          <w:lang w:val="el-GR"/>
+        </w:rPr>
+      </w:pPr>
+      <w:r>
+        <w:rPr>
+          <w:lang w:val="el-GR"/>
+        </w:rPr>
+        <w:t>ἠ χαρα</w:t>
+      </w:r>
+      <w:r>
+        <w:t xml:space="preserve"> - singular nominative</w:t>
+      </w:r>
+    </w:p>
+    <w:p>
+      <w:pPr>
+        <w:pStyle w:val="ListParagraph"/>
+        <w:rPr>
+          <w:lang w:val="el-GR"/>
+        </w:rPr>
+      </w:pPr>
+    </w:p>
+    <w:p>
+      <w:pPr>
+        <w:pStyle w:val="ListParagraph"/>
+        <w:ind w:left="360"/>
+      </w:pPr>
+      <w:r>
+        <w:rPr>
+          <w:lang w:val="el-GR"/>
+        </w:rPr>
+        <w:t>του κυριου</w:t>
+      </w:r>
+      <w:r>
+        <w:t xml:space="preserve"> – singular genitive</w:t>
+      </w:r>
+    </w:p>
+    <w:p>
+      <w:pPr>
+        <w:pStyle w:val="ListParagraph"/>
+        <w:rPr>
+          <w:lang w:val="el-GR"/>
+        </w:rPr>
+      </w:pPr>
+    </w:p>
+    <w:p>
+      <w:pPr>
+        <w:pStyle w:val="ListParagraph"/>
+        <w:ind w:left="360"/>
+      </w:pPr>
+      <w:r>
+        <w:rPr>
+          <w:lang w:val="el-GR"/>
+        </w:rPr>
+        <w:t>ἐτηρεσεν</w:t>
+      </w:r>
+      <w:r>
+        <w:t xml:space="preserve"> </w:t>
+      </w:r>
+      <w:r>
+        <w:t>-  3rd person singular</w:t>
+      </w:r>
+      <w:r>
+        <w:t xml:space="preserve"> </w:t>
+      </w:r>
+      <w:r>
+        <w:t xml:space="preserve">aorist indicative of </w:t>
+      </w:r>
+      <w:r>
+        <w:rPr>
+          <w:lang w:val="el-GR"/>
+        </w:rPr>
+        <w:t>τηρεω</w:t>
+      </w:r>
+    </w:p>
+    <w:p>
+      <w:pPr>
+        <w:pStyle w:val="ListParagraph"/>
+        <w:ind w:left="360"/>
+      </w:pPr>
+    </w:p>
+    <w:p>
+      <w:pPr>
+        <w:pStyle w:val="ListParagraph"/>
+        <w:ind w:left="360"/>
+      </w:pPr>
+      <w:r>
+        <w:rPr>
+          <w:lang w:val="el-GR"/>
+        </w:rPr>
+        <w:t>ἠμας</w:t>
+      </w:r>
+      <w:r>
+        <w:t xml:space="preserve"> – 1</w:t>
+      </w:r>
+      <w:r>
+        <w:rPr>
+          <w:vertAlign w:val="superscript"/>
+        </w:rPr>
+        <w:t>st</w:t>
+      </w:r>
+      <w:r>
+        <w:t xml:space="preserve"> person plural accusative</w:t>
+      </w:r>
+    </w:p>
+    <w:p>
+      <w:pPr>
+        <w:pStyle w:val="ListParagraph"/>
+        <w:ind w:left="360"/>
+      </w:pPr>
+    </w:p>
+    <w:p>
+      <w:pPr>
+        <w:pStyle w:val="ListParagraph"/>
+        <w:ind w:left="360"/>
+      </w:pPr>
+      <w:r>
+        <w:rPr>
+          <w:lang w:val="el-GR"/>
+        </w:rPr>
+        <w:t>ἐν</w:t>
+      </w:r>
+      <w:r>
+        <w:t xml:space="preserve"> </w:t>
+      </w:r>
+      <w:r>
+        <w:t>– (in)</w:t>
+      </w:r>
+    </w:p>
+    <w:p>
+      <w:pPr>
+        <w:pStyle w:val="ListParagraph"/>
+        <w:ind w:left="360"/>
+      </w:pPr>
+    </w:p>
+    <w:p>
+      <w:pPr>
+        <w:pStyle w:val="ListParagraph"/>
+        <w:ind w:left="360"/>
+      </w:pPr>
+      <w:r>
+        <w:rPr>
+          <w:lang w:val="el-GR"/>
+        </w:rPr>
+        <w:t>τω</w:t>
+      </w:r>
+      <w:r>
+        <w:t xml:space="preserve"> </w:t>
+      </w:r>
+      <w:r>
+        <w:rPr>
+          <w:lang w:val="el-GR"/>
+        </w:rPr>
+        <w:t>πλοιω</w:t>
+      </w:r>
+      <w:r>
+        <w:t xml:space="preserve"> – singular dative of </w:t>
+      </w:r>
+      <w:r>
+        <w:t>πλοῖον</w:t>
+      </w:r>
+      <w:r>
+        <w:t xml:space="preserve"> (boat, ship)</w:t>
+      </w:r>
+    </w:p>
+    <w:p>
+      <w:pPr>
+        <w:pStyle w:val="ListParagraph"/>
+        <w:ind w:left="360"/>
+      </w:pPr>
+    </w:p>
     <w:sectPr>
       <w:pgSz w:w="12240" w:h="15840"/>
       <w:pgMar w:top="1440" w:right="1440" w:bottom="1440" w:left="1440" w:header="720" w:footer="720" w:gutter="0"/>
@@ -6412,11 +7182,103 @@
       </w:rPr>
     </w:lvl>
   </w:abstractNum>
+  <w:abstractNum w:abstractNumId="2" w15:restartNumberingAfterBreak="0">
+    <w:nsid w:val="584B00FA"/>
+    <w:multiLevelType w:val="hybridMultilevel"/>
+    <w:tmpl w:val="97A87B64"/>
+    <w:lvl w:ilvl="0" w:tplc="0409000F">
+      <w:start w:val="1"/>
+      <w:numFmt w:val="decimal"/>
+      <w:lvlText w:val="%1."/>
+      <w:lvlJc w:val="left"/>
+      <w:pPr>
+        <w:ind w:left="360" w:hanging="360"/>
+      </w:pPr>
+      <w:rPr>
+        <w:rFonts w:hint="default"/>
+      </w:rPr>
+    </w:lvl>
+    <w:lvl w:ilvl="1" w:tplc="04090019" w:tentative="1">
+      <w:start w:val="1"/>
+      <w:numFmt w:val="lowerLetter"/>
+      <w:lvlText w:val="%2."/>
+      <w:lvlJc w:val="left"/>
+      <w:pPr>
+        <w:ind w:left="1080" w:hanging="360"/>
+      </w:pPr>
+    </w:lvl>
+    <w:lvl w:ilvl="2" w:tplc="0409001B" w:tentative="1">
+      <w:start w:val="1"/>
+      <w:numFmt w:val="lowerRoman"/>
+      <w:lvlText w:val="%3."/>
+      <w:lvlJc w:val="right"/>
+      <w:pPr>
+        <w:ind w:left="1800" w:hanging="180"/>
+      </w:pPr>
+    </w:lvl>
+    <w:lvl w:ilvl="3" w:tplc="0409000F" w:tentative="1">
+      <w:start w:val="1"/>
+      <w:numFmt w:val="decimal"/>
+      <w:lvlText w:val="%4."/>
+      <w:lvlJc w:val="left"/>
+      <w:pPr>
+        <w:ind w:left="2520" w:hanging="360"/>
+      </w:pPr>
+    </w:lvl>
+    <w:lvl w:ilvl="4" w:tplc="04090019" w:tentative="1">
+      <w:start w:val="1"/>
+      <w:numFmt w:val="lowerLetter"/>
+      <w:lvlText w:val="%5."/>
+      <w:lvlJc w:val="left"/>
+      <w:pPr>
+        <w:ind w:left="3240" w:hanging="360"/>
+      </w:pPr>
+    </w:lvl>
+    <w:lvl w:ilvl="5" w:tplc="0409001B" w:tentative="1">
+      <w:start w:val="1"/>
+      <w:numFmt w:val="lowerRoman"/>
+      <w:lvlText w:val="%6."/>
+      <w:lvlJc w:val="right"/>
+      <w:pPr>
+        <w:ind w:left="3960" w:hanging="180"/>
+      </w:pPr>
+    </w:lvl>
+    <w:lvl w:ilvl="6" w:tplc="0409000F" w:tentative="1">
+      <w:start w:val="1"/>
+      <w:numFmt w:val="decimal"/>
+      <w:lvlText w:val="%7."/>
+      <w:lvlJc w:val="left"/>
+      <w:pPr>
+        <w:ind w:left="4680" w:hanging="360"/>
+      </w:pPr>
+    </w:lvl>
+    <w:lvl w:ilvl="7" w:tplc="04090019" w:tentative="1">
+      <w:start w:val="1"/>
+      <w:numFmt w:val="lowerLetter"/>
+      <w:lvlText w:val="%8."/>
+      <w:lvlJc w:val="left"/>
+      <w:pPr>
+        <w:ind w:left="5400" w:hanging="360"/>
+      </w:pPr>
+    </w:lvl>
+    <w:lvl w:ilvl="8" w:tplc="0409001B" w:tentative="1">
+      <w:start w:val="1"/>
+      <w:numFmt w:val="lowerRoman"/>
+      <w:lvlText w:val="%9."/>
+      <w:lvlJc w:val="right"/>
+      <w:pPr>
+        <w:ind w:left="6120" w:hanging="180"/>
+      </w:pPr>
+    </w:lvl>
+  </w:abstractNum>
   <w:num w:numId="1" w16cid:durableId="1246037907">
     <w:abstractNumId w:val="0"/>
   </w:num>
   <w:num w:numId="2" w16cid:durableId="1418746239">
     <w:abstractNumId w:val="1"/>
+  </w:num>
+  <w:num w:numId="3" w16cid:durableId="1036856441">
+    <w:abstractNumId w:val="2"/>
   </w:num>
 </w:numbering>
 </file>
@@ -6896,6 +7758,17 @@
       <w:szCs w:val="16"/>
     </w:rPr>
   </w:style>
+  <w:style w:type="paragraph" w:styleId="ListParagraph">
+    <w:name w:val="List Paragraph"/>
+    <w:basedOn w:val="Normal"/>
+    <w:uiPriority w:val="34"/>
+    <w:qFormat/>
+    <w:rsid w:val="002B27DA"/>
+    <w:pPr>
+      <w:ind w:left="720"/>
+      <w:contextualSpacing/>
+    </w:pPr>
+  </w:style>
 </w:styles>
 </file>
 

</xml_diff>